<commit_message>
docs: lazy-proof the User Manual + all reference guides
User Manual: every one of the 23 chapters now opens with a plain-language
"QUICK VERSION" summary for skimmers, on top of the existing step-by-step detail.

Reference guides (AI_ASSIST, DEPLOYMENT, DOCKER, MANTISBT_IMPORT, PUBLIC_TICKETS,
TABLET_AND_NETWORK_ACCESS): rewritten for a lazy, non-technical reader — an
"In a nutshell" summary up top, every step/click spelled out, acronyms defined
on first use, and literal placeholders (SERVER-IP, API keys) replaced with
"use your real value" plus concrete examples. All commands, ports, endpoints,
config keys, and model ids preserved exactly; only the prose/structure changed.

Co-Authored-By: Claude Opus 4.8 <noreply@anthropic.com>
</commit_message>
<xml_diff>
--- a/docs/guides/OpenTrack_User_Manual.docx
+++ b/docs/guides/OpenTrack_User_Manual.docx
@@ -375,6 +375,103 @@
     <w:p>
       <w:pPr>
         <w:spacing w:after="40"/>
+      </w:pPr>
+    </w:p>
+    <w:tbl>
+      <w:tblPr>
+        <w:tblW w:type="auto" w:w="0"/>
+        <w:jc w:val="center"/>
+        <w:tblLayout w:type="fixed"/>
+        <w:tblLook w:firstColumn="1" w:firstRow="1" w:lastColumn="0" w:lastRow="0" w:noHBand="0" w:noVBand="1" w:val="04A0"/>
+      </w:tblPr>
+      <w:tblGrid>
+        <w:gridCol w:w="9360"/>
+      </w:tblGrid>
+      <w:tr>
+        <w:trPr>
+          <w:cantSplit/>
+        </w:trPr>
+        <w:tc>
+          <w:tcPr>
+            <w:tcW w:type="dxa" w:w="9360"/>
+            <w:shd w:val="clear" w:color="auto" w:fill="E8F5E9"/>
+            <w:tcBorders>
+              <w:top w:val="single" w:sz="4" w:space="0" w:color="43A047"/>
+              <w:left w:val="single" w:sz="30" w:space="0" w:color="43A047"/>
+              <w:bottom w:val="single" w:sz="4" w:space="0" w:color="43A047"/>
+              <w:right w:val="single" w:sz="4" w:space="0" w:color="43A047"/>
+            </w:tcBorders>
+            <w:tcMar>
+              <w:top w:w="110" w:type="dxa"/>
+              <w:start w:w="170" w:type="dxa"/>
+              <w:bottom w:w="110" w:type="dxa"/>
+              <w:end w:w="170" w:type="dxa"/>
+            </w:tcMar>
+          </w:tcPr>
+          <w:p>
+            <w:pPr>
+              <w:spacing w:after="0"/>
+            </w:pPr>
+            <w:r>
+              <w:rPr>
+                <w:b/>
+                <w:color w:val="2E7D32"/>
+                <w:sz w:val="21"/>
+              </w:rPr>
+              <w:t xml:space="preserve">QUICK VERSION   </w:t>
+            </w:r>
+            <w:r>
+              <w:rPr>
+                <w:color w:val="222B38"/>
+              </w:rPr>
+              <w:t xml:space="preserve">Open OpenTrack in a web browser (or the desktop app), sign in — or click </w:t>
+            </w:r>
+            <w:r>
+              <w:rPr>
+                <w:b/>
+                <w:color w:val="222B38"/>
+              </w:rPr>
+              <w:t>Register</w:t>
+            </w:r>
+            <w:r>
+              <w:rPr>
+                <w:color w:val="222B38"/>
+              </w:rPr>
+              <w:t xml:space="preserve"> the first time — and you're in. There's a menu down the </w:t>
+            </w:r>
+            <w:r>
+              <w:rPr>
+                <w:b/>
+                <w:color w:val="222B38"/>
+              </w:rPr>
+              <w:t>left</w:t>
+            </w:r>
+            <w:r>
+              <w:rPr>
+                <w:color w:val="222B38"/>
+              </w:rPr>
+              <w:t xml:space="preserve"> and your work in the </w:t>
+            </w:r>
+            <w:r>
+              <w:rPr>
+                <w:b/>
+                <w:color w:val="222B38"/>
+              </w:rPr>
+              <w:t>middle</w:t>
+            </w:r>
+            <w:r>
+              <w:rPr>
+                <w:color w:val="222B38"/>
+              </w:rPr>
+              <w:t>. That's the whole layout.</w:t>
+            </w:r>
+          </w:p>
+        </w:tc>
+      </w:tr>
+    </w:tbl>
+    <w:p>
+      <w:pPr>
+        <w:spacing w:after="80"/>
       </w:pPr>
     </w:p>
     <w:p>
@@ -1568,6 +1665,116 @@
         <w:spacing w:after="40"/>
       </w:pPr>
     </w:p>
+    <w:tbl>
+      <w:tblPr>
+        <w:tblW w:type="auto" w:w="0"/>
+        <w:jc w:val="center"/>
+        <w:tblLayout w:type="fixed"/>
+        <w:tblLook w:firstColumn="1" w:firstRow="1" w:lastColumn="0" w:lastRow="0" w:noHBand="0" w:noVBand="1" w:val="04A0"/>
+      </w:tblPr>
+      <w:tblGrid>
+        <w:gridCol w:w="9360"/>
+      </w:tblGrid>
+      <w:tr>
+        <w:trPr>
+          <w:cantSplit/>
+        </w:trPr>
+        <w:tc>
+          <w:tcPr>
+            <w:tcW w:type="dxa" w:w="9360"/>
+            <w:shd w:val="clear" w:color="auto" w:fill="E8F5E9"/>
+            <w:tcBorders>
+              <w:top w:val="single" w:sz="4" w:space="0" w:color="43A047"/>
+              <w:left w:val="single" w:sz="30" w:space="0" w:color="43A047"/>
+              <w:bottom w:val="single" w:sz="4" w:space="0" w:color="43A047"/>
+              <w:right w:val="single" w:sz="4" w:space="0" w:color="43A047"/>
+            </w:tcBorders>
+            <w:tcMar>
+              <w:top w:w="110" w:type="dxa"/>
+              <w:start w:w="170" w:type="dxa"/>
+              <w:bottom w:w="110" w:type="dxa"/>
+              <w:end w:w="170" w:type="dxa"/>
+            </w:tcMar>
+          </w:tcPr>
+          <w:p>
+            <w:pPr>
+              <w:spacing w:after="0"/>
+            </w:pPr>
+            <w:r>
+              <w:rPr>
+                <w:b/>
+                <w:color w:val="2E7D32"/>
+                <w:sz w:val="21"/>
+              </w:rPr>
+              <w:t xml:space="preserve">QUICK VERSION   </w:t>
+            </w:r>
+            <w:r>
+              <w:rPr>
+                <w:color w:val="222B38"/>
+              </w:rPr>
+              <w:t xml:space="preserve">The </w:t>
+            </w:r>
+            <w:r>
+              <w:rPr>
+                <w:b/>
+                <w:color w:val="222B38"/>
+              </w:rPr>
+              <w:t>Dashboard</w:t>
+            </w:r>
+            <w:r>
+              <w:rPr>
+                <w:color w:val="222B38"/>
+              </w:rPr>
+              <w:t xml:space="preserve"> is your home screen. Across every project it shows how many issues are </w:t>
+            </w:r>
+            <w:r>
+              <w:rPr>
+                <w:b/>
+                <w:color w:val="222B38"/>
+              </w:rPr>
+              <w:t>open</w:t>
+            </w:r>
+            <w:r>
+              <w:rPr>
+                <w:color w:val="222B38"/>
+              </w:rPr>
+              <w:t xml:space="preserve">, </w:t>
+            </w:r>
+            <w:r>
+              <w:rPr>
+                <w:b/>
+                <w:color w:val="222B38"/>
+              </w:rPr>
+              <w:t>overdue</w:t>
+            </w:r>
+            <w:r>
+              <w:rPr>
+                <w:color w:val="222B38"/>
+              </w:rPr>
+              <w:t xml:space="preserve">, and </w:t>
+            </w:r>
+            <w:r>
+              <w:rPr>
+                <w:b/>
+                <w:color w:val="222B38"/>
+              </w:rPr>
+              <w:t>stale</w:t>
+            </w:r>
+            <w:r>
+              <w:rPr>
+                <w:color w:val="222B38"/>
+              </w:rPr>
+              <w:t xml:space="preserve"> (forgotten), with links to jump straight to them.</w:t>
+            </w:r>
+          </w:p>
+        </w:tc>
+      </w:tr>
+    </w:tbl>
+    <w:p>
+      <w:pPr>
+        <w:spacing w:after="80"/>
+      </w:pPr>
+    </w:p>
     <w:p>
       <w:pPr>
         <w:pStyle w:val="Heading1"/>
@@ -2369,6 +2576,155 @@
         <w:spacing w:after="40"/>
       </w:pPr>
     </w:p>
+    <w:tbl>
+      <w:tblPr>
+        <w:tblW w:type="auto" w:w="0"/>
+        <w:jc w:val="center"/>
+        <w:tblLayout w:type="fixed"/>
+        <w:tblLook w:firstColumn="1" w:firstRow="1" w:lastColumn="0" w:lastRow="0" w:noHBand="0" w:noVBand="1" w:val="04A0"/>
+      </w:tblPr>
+      <w:tblGrid>
+        <w:gridCol w:w="9360"/>
+      </w:tblGrid>
+      <w:tr>
+        <w:trPr>
+          <w:cantSplit/>
+        </w:trPr>
+        <w:tc>
+          <w:tcPr>
+            <w:tcW w:type="dxa" w:w="9360"/>
+            <w:shd w:val="clear" w:color="auto" w:fill="E8F5E9"/>
+            <w:tcBorders>
+              <w:top w:val="single" w:sz="4" w:space="0" w:color="43A047"/>
+              <w:left w:val="single" w:sz="30" w:space="0" w:color="43A047"/>
+              <w:bottom w:val="single" w:sz="4" w:space="0" w:color="43A047"/>
+              <w:right w:val="single" w:sz="4" w:space="0" w:color="43A047"/>
+            </w:tcBorders>
+            <w:tcMar>
+              <w:top w:w="110" w:type="dxa"/>
+              <w:start w:w="170" w:type="dxa"/>
+              <w:bottom w:w="110" w:type="dxa"/>
+              <w:end w:w="170" w:type="dxa"/>
+            </w:tcMar>
+          </w:tcPr>
+          <w:p>
+            <w:pPr>
+              <w:spacing w:after="0"/>
+            </w:pPr>
+            <w:r>
+              <w:rPr>
+                <w:b/>
+                <w:color w:val="2E7D32"/>
+                <w:sz w:val="21"/>
+              </w:rPr>
+              <w:t xml:space="preserve">QUICK VERSION   </w:t>
+            </w:r>
+            <w:r>
+              <w:rPr>
+                <w:color w:val="222B38"/>
+              </w:rPr>
+              <w:t xml:space="preserve">A </w:t>
+            </w:r>
+            <w:r>
+              <w:rPr>
+                <w:b/>
+                <w:color w:val="222B38"/>
+              </w:rPr>
+              <w:t>project</w:t>
+            </w:r>
+            <w:r>
+              <w:rPr>
+                <w:color w:val="222B38"/>
+              </w:rPr>
+              <w:t xml:space="preserve"> holds issues. To make one: click </w:t>
+            </w:r>
+            <w:r>
+              <w:rPr>
+                <w:b/>
+                <w:color w:val="222B38"/>
+              </w:rPr>
+              <w:t>Projects</w:t>
+            </w:r>
+            <w:r>
+              <w:rPr>
+                <w:color w:val="222B38"/>
+              </w:rPr>
+              <w:t xml:space="preserve"> on the left, then </w:t>
+            </w:r>
+            <w:r>
+              <w:rPr>
+                <w:b/>
+                <w:color w:val="222B38"/>
+              </w:rPr>
+              <w:t>New project</w:t>
+            </w:r>
+            <w:r>
+              <w:rPr>
+                <w:color w:val="222B38"/>
+              </w:rPr>
+              <w:t xml:space="preserve">, give it a name, and click </w:t>
+            </w:r>
+            <w:r>
+              <w:rPr>
+                <w:b/>
+                <w:color w:val="222B38"/>
+              </w:rPr>
+              <w:t>Create</w:t>
+            </w:r>
+            <w:r>
+              <w:rPr>
+                <w:color w:val="222B38"/>
+              </w:rPr>
+              <w:t xml:space="preserve">. Optionally add </w:t>
+            </w:r>
+            <w:r>
+              <w:rPr>
+                <w:b/>
+                <w:color w:val="222B38"/>
+              </w:rPr>
+              <w:t>categories</w:t>
+            </w:r>
+            <w:r>
+              <w:rPr>
+                <w:color w:val="222B38"/>
+              </w:rPr>
+              <w:t xml:space="preserve"> and </w:t>
+            </w:r>
+            <w:r>
+              <w:rPr>
+                <w:b/>
+                <w:color w:val="222B38"/>
+              </w:rPr>
+              <w:t>versions</w:t>
+            </w:r>
+            <w:r>
+              <w:rPr>
+                <w:color w:val="222B38"/>
+              </w:rPr>
+              <w:t xml:space="preserve"> under its </w:t>
+            </w:r>
+            <w:r>
+              <w:rPr>
+                <w:b/>
+                <w:color w:val="222B38"/>
+              </w:rPr>
+              <w:t>Settings</w:t>
+            </w:r>
+            <w:r>
+              <w:rPr>
+                <w:color w:val="222B38"/>
+              </w:rPr>
+              <w:t>.</w:t>
+            </w:r>
+          </w:p>
+        </w:tc>
+      </w:tr>
+    </w:tbl>
+    <w:p>
+      <w:pPr>
+        <w:spacing w:after="80"/>
+      </w:pPr>
+    </w:p>
     <w:p>
       <w:pPr>
         <w:pStyle w:val="Heading1"/>
@@ -3273,6 +3629,129 @@
     <w:p>
       <w:pPr>
         <w:spacing w:after="40"/>
+      </w:pPr>
+    </w:p>
+    <w:tbl>
+      <w:tblPr>
+        <w:tblW w:type="auto" w:w="0"/>
+        <w:jc w:val="center"/>
+        <w:tblLayout w:type="fixed"/>
+        <w:tblLook w:firstColumn="1" w:firstRow="1" w:lastColumn="0" w:lastRow="0" w:noHBand="0" w:noVBand="1" w:val="04A0"/>
+      </w:tblPr>
+      <w:tblGrid>
+        <w:gridCol w:w="9360"/>
+      </w:tblGrid>
+      <w:tr>
+        <w:trPr>
+          <w:cantSplit/>
+        </w:trPr>
+        <w:tc>
+          <w:tcPr>
+            <w:tcW w:type="dxa" w:w="9360"/>
+            <w:shd w:val="clear" w:color="auto" w:fill="E8F5E9"/>
+            <w:tcBorders>
+              <w:top w:val="single" w:sz="4" w:space="0" w:color="43A047"/>
+              <w:left w:val="single" w:sz="30" w:space="0" w:color="43A047"/>
+              <w:bottom w:val="single" w:sz="4" w:space="0" w:color="43A047"/>
+              <w:right w:val="single" w:sz="4" w:space="0" w:color="43A047"/>
+            </w:tcBorders>
+            <w:tcMar>
+              <w:top w:w="110" w:type="dxa"/>
+              <w:start w:w="170" w:type="dxa"/>
+              <w:bottom w:w="110" w:type="dxa"/>
+              <w:end w:w="170" w:type="dxa"/>
+            </w:tcMar>
+          </w:tcPr>
+          <w:p>
+            <w:pPr>
+              <w:spacing w:after="0"/>
+            </w:pPr>
+            <w:r>
+              <w:rPr>
+                <w:b/>
+                <w:color w:val="2E7D32"/>
+                <w:sz w:val="21"/>
+              </w:rPr>
+              <w:t xml:space="preserve">QUICK VERSION   </w:t>
+            </w:r>
+            <w:r>
+              <w:rPr>
+                <w:color w:val="222B38"/>
+              </w:rPr>
+              <w:t xml:space="preserve">Open a project, click </w:t>
+            </w:r>
+            <w:r>
+              <w:rPr>
+                <w:b/>
+                <w:color w:val="222B38"/>
+              </w:rPr>
+              <w:t>Members</w:t>
+            </w:r>
+            <w:r>
+              <w:rPr>
+                <w:color w:val="222B38"/>
+              </w:rPr>
+              <w:t xml:space="preserve">, type someone's email, pick a </w:t>
+            </w:r>
+            <w:r>
+              <w:rPr>
+                <w:b/>
+                <w:color w:val="222B38"/>
+              </w:rPr>
+              <w:t>role</w:t>
+            </w:r>
+            <w:r>
+              <w:rPr>
+                <w:color w:val="222B38"/>
+              </w:rPr>
+              <w:t xml:space="preserve">, and click </w:t>
+            </w:r>
+            <w:r>
+              <w:rPr>
+                <w:b/>
+                <w:color w:val="222B38"/>
+              </w:rPr>
+              <w:t>Add</w:t>
+            </w:r>
+            <w:r>
+              <w:rPr>
+                <w:color w:val="222B38"/>
+              </w:rPr>
+              <w:t xml:space="preserve">. The role decides what they can do — from </w:t>
+            </w:r>
+            <w:r>
+              <w:rPr>
+                <w:b/>
+                <w:color w:val="222B38"/>
+              </w:rPr>
+              <w:t>Reporter</w:t>
+            </w:r>
+            <w:r>
+              <w:rPr>
+                <w:color w:val="222B38"/>
+              </w:rPr>
+              <w:t xml:space="preserve"> (file issues) up to </w:t>
+            </w:r>
+            <w:r>
+              <w:rPr>
+                <w:b/>
+                <w:color w:val="222B38"/>
+              </w:rPr>
+              <w:t>Administrator</w:t>
+            </w:r>
+            <w:r>
+              <w:rPr>
+                <w:color w:val="222B38"/>
+              </w:rPr>
+              <w:t xml:space="preserve"> (runs everything).</w:t>
+            </w:r>
+          </w:p>
+        </w:tc>
+      </w:tr>
+    </w:tbl>
+    <w:p>
+      <w:pPr>
+        <w:spacing w:after="80"/>
       </w:pPr>
     </w:p>
     <w:p>
@@ -4169,6 +4648,129 @@
         <w:spacing w:after="40"/>
       </w:pPr>
     </w:p>
+    <w:tbl>
+      <w:tblPr>
+        <w:tblW w:type="auto" w:w="0"/>
+        <w:jc w:val="center"/>
+        <w:tblLayout w:type="fixed"/>
+        <w:tblLook w:firstColumn="1" w:firstRow="1" w:lastColumn="0" w:lastRow="0" w:noHBand="0" w:noVBand="1" w:val="04A0"/>
+      </w:tblPr>
+      <w:tblGrid>
+        <w:gridCol w:w="9360"/>
+      </w:tblGrid>
+      <w:tr>
+        <w:trPr>
+          <w:cantSplit/>
+        </w:trPr>
+        <w:tc>
+          <w:tcPr>
+            <w:tcW w:type="dxa" w:w="9360"/>
+            <w:shd w:val="clear" w:color="auto" w:fill="E8F5E9"/>
+            <w:tcBorders>
+              <w:top w:val="single" w:sz="4" w:space="0" w:color="43A047"/>
+              <w:left w:val="single" w:sz="30" w:space="0" w:color="43A047"/>
+              <w:bottom w:val="single" w:sz="4" w:space="0" w:color="43A047"/>
+              <w:right w:val="single" w:sz="4" w:space="0" w:color="43A047"/>
+            </w:tcBorders>
+            <w:tcMar>
+              <w:top w:w="110" w:type="dxa"/>
+              <w:start w:w="170" w:type="dxa"/>
+              <w:bottom w:w="110" w:type="dxa"/>
+              <w:end w:w="170" w:type="dxa"/>
+            </w:tcMar>
+          </w:tcPr>
+          <w:p>
+            <w:pPr>
+              <w:spacing w:after="0"/>
+            </w:pPr>
+            <w:r>
+              <w:rPr>
+                <w:b/>
+                <w:color w:val="2E7D32"/>
+                <w:sz w:val="21"/>
+              </w:rPr>
+              <w:t xml:space="preserve">QUICK VERSION   </w:t>
+            </w:r>
+            <w:r>
+              <w:rPr>
+                <w:color w:val="222B38"/>
+              </w:rPr>
+              <w:t xml:space="preserve">Open a project, click </w:t>
+            </w:r>
+            <w:r>
+              <w:rPr>
+                <w:b/>
+                <w:color w:val="222B38"/>
+              </w:rPr>
+              <w:t>New Issue</w:t>
+            </w:r>
+            <w:r>
+              <w:rPr>
+                <w:color w:val="222B38"/>
+              </w:rPr>
+              <w:t xml:space="preserve">, type a </w:t>
+            </w:r>
+            <w:r>
+              <w:rPr>
+                <w:b/>
+                <w:color w:val="222B38"/>
+              </w:rPr>
+              <w:t>title</w:t>
+            </w:r>
+            <w:r>
+              <w:rPr>
+                <w:color w:val="222B38"/>
+              </w:rPr>
+              <w:t xml:space="preserve"> and </w:t>
+            </w:r>
+            <w:r>
+              <w:rPr>
+                <w:b/>
+                <w:color w:val="222B38"/>
+              </w:rPr>
+              <w:t>description</w:t>
+            </w:r>
+            <w:r>
+              <w:rPr>
+                <w:color w:val="222B38"/>
+              </w:rPr>
+              <w:t xml:space="preserve">, set the severity and priority, and click </w:t>
+            </w:r>
+            <w:r>
+              <w:rPr>
+                <w:b/>
+                <w:color w:val="222B38"/>
+              </w:rPr>
+              <w:t>Submit</w:t>
+            </w:r>
+            <w:r>
+              <w:rPr>
+                <w:color w:val="222B38"/>
+              </w:rPr>
+              <w:t xml:space="preserve">. Done — a bug is filed. In a hurry? Use </w:t>
+            </w:r>
+            <w:r>
+              <w:rPr>
+                <w:b/>
+                <w:color w:val="222B38"/>
+              </w:rPr>
+              <w:t>Quick-capture</w:t>
+            </w:r>
+            <w:r>
+              <w:rPr>
+                <w:color w:val="222B38"/>
+              </w:rPr>
+              <w:t>.</w:t>
+            </w:r>
+          </w:p>
+        </w:tc>
+      </w:tr>
+    </w:tbl>
+    <w:p>
+      <w:pPr>
+        <w:spacing w:after="80"/>
+      </w:pPr>
+    </w:p>
     <w:p>
       <w:pPr>
         <w:pStyle w:val="Heading1"/>
@@ -5906,6 +6508,64 @@
     <w:p>
       <w:pPr>
         <w:spacing w:after="40"/>
+      </w:pPr>
+    </w:p>
+    <w:tbl>
+      <w:tblPr>
+        <w:tblW w:type="auto" w:w="0"/>
+        <w:jc w:val="center"/>
+        <w:tblLayout w:type="fixed"/>
+        <w:tblLook w:firstColumn="1" w:firstRow="1" w:lastColumn="0" w:lastRow="0" w:noHBand="0" w:noVBand="1" w:val="04A0"/>
+      </w:tblPr>
+      <w:tblGrid>
+        <w:gridCol w:w="9360"/>
+      </w:tblGrid>
+      <w:tr>
+        <w:trPr>
+          <w:cantSplit/>
+        </w:trPr>
+        <w:tc>
+          <w:tcPr>
+            <w:tcW w:type="dxa" w:w="9360"/>
+            <w:shd w:val="clear" w:color="auto" w:fill="E8F5E9"/>
+            <w:tcBorders>
+              <w:top w:val="single" w:sz="4" w:space="0" w:color="43A047"/>
+              <w:left w:val="single" w:sz="30" w:space="0" w:color="43A047"/>
+              <w:bottom w:val="single" w:sz="4" w:space="0" w:color="43A047"/>
+              <w:right w:val="single" w:sz="4" w:space="0" w:color="43A047"/>
+            </w:tcBorders>
+            <w:tcMar>
+              <w:top w:w="110" w:type="dxa"/>
+              <w:start w:w="170" w:type="dxa"/>
+              <w:bottom w:w="110" w:type="dxa"/>
+              <w:end w:w="170" w:type="dxa"/>
+            </w:tcMar>
+          </w:tcPr>
+          <w:p>
+            <w:pPr>
+              <w:spacing w:after="0"/>
+            </w:pPr>
+            <w:r>
+              <w:rPr>
+                <w:b/>
+                <w:color w:val="2E7D32"/>
+                <w:sz w:val="21"/>
+              </w:rPr>
+              <w:t xml:space="preserve">QUICK VERSION   </w:t>
+            </w:r>
+            <w:r>
+              <w:rPr>
+                <w:color w:val="222B38"/>
+              </w:rPr>
+              <w:t>Everything about one issue lives on its own page: its status and key details up top, then the description, notes, attachments, links to related issues, and a full history below.</w:t>
+            </w:r>
+          </w:p>
+        </w:tc>
+      </w:tr>
+    </w:tbl>
+    <w:p>
+      <w:pPr>
+        <w:spacing w:after="80"/>
       </w:pPr>
     </w:p>
     <w:p>
@@ -7351,6 +8011,90 @@
         <w:spacing w:after="40"/>
       </w:pPr>
     </w:p>
+    <w:tbl>
+      <w:tblPr>
+        <w:tblW w:type="auto" w:w="0"/>
+        <w:jc w:val="center"/>
+        <w:tblLayout w:type="fixed"/>
+        <w:tblLook w:firstColumn="1" w:firstRow="1" w:lastColumn="0" w:lastRow="0" w:noHBand="0" w:noVBand="1" w:val="04A0"/>
+      </w:tblPr>
+      <w:tblGrid>
+        <w:gridCol w:w="9360"/>
+      </w:tblGrid>
+      <w:tr>
+        <w:trPr>
+          <w:cantSplit/>
+        </w:trPr>
+        <w:tc>
+          <w:tcPr>
+            <w:tcW w:type="dxa" w:w="9360"/>
+            <w:shd w:val="clear" w:color="auto" w:fill="E8F5E9"/>
+            <w:tcBorders>
+              <w:top w:val="single" w:sz="4" w:space="0" w:color="43A047"/>
+              <w:left w:val="single" w:sz="30" w:space="0" w:color="43A047"/>
+              <w:bottom w:val="single" w:sz="4" w:space="0" w:color="43A047"/>
+              <w:right w:val="single" w:sz="4" w:space="0" w:color="43A047"/>
+            </w:tcBorders>
+            <w:tcMar>
+              <w:top w:w="110" w:type="dxa"/>
+              <w:start w:w="170" w:type="dxa"/>
+              <w:bottom w:w="110" w:type="dxa"/>
+              <w:end w:w="170" w:type="dxa"/>
+            </w:tcMar>
+          </w:tcPr>
+          <w:p>
+            <w:pPr>
+              <w:spacing w:after="0"/>
+            </w:pPr>
+            <w:r>
+              <w:rPr>
+                <w:b/>
+                <w:color w:val="2E7D32"/>
+                <w:sz w:val="21"/>
+              </w:rPr>
+              <w:t xml:space="preserve">QUICK VERSION   </w:t>
+            </w:r>
+            <w:r>
+              <w:rPr>
+                <w:color w:val="222B38"/>
+              </w:rPr>
+              <w:t xml:space="preserve">Click </w:t>
+            </w:r>
+            <w:r>
+              <w:rPr>
+                <w:b/>
+                <w:color w:val="222B38"/>
+              </w:rPr>
+              <w:t>Edit</w:t>
+            </w:r>
+            <w:r>
+              <w:rPr>
+                <w:color w:val="222B38"/>
+              </w:rPr>
+              <w:t xml:space="preserve"> to change any field, move the issue through its statuses (New → … → Resolved → Closed), assign it to a person, and choose a </w:t>
+            </w:r>
+            <w:r>
+              <w:rPr>
+                <w:b/>
+                <w:color w:val="222B38"/>
+              </w:rPr>
+              <w:t>resolution</w:t>
+            </w:r>
+            <w:r>
+              <w:rPr>
+                <w:color w:val="222B38"/>
+              </w:rPr>
+              <w:t xml:space="preserve"> when it's finished.</w:t>
+            </w:r>
+          </w:p>
+        </w:tc>
+      </w:tr>
+    </w:tbl>
+    <w:p>
+      <w:pPr>
+        <w:spacing w:after="80"/>
+      </w:pPr>
+    </w:p>
     <w:p>
       <w:pPr>
         <w:pStyle w:val="Heading1"/>
@@ -8472,6 +9216,116 @@
         <w:spacing w:after="40"/>
       </w:pPr>
     </w:p>
+    <w:tbl>
+      <w:tblPr>
+        <w:tblW w:type="auto" w:w="0"/>
+        <w:jc w:val="center"/>
+        <w:tblLayout w:type="fixed"/>
+        <w:tblLook w:firstColumn="1" w:firstRow="1" w:lastColumn="0" w:lastRow="0" w:noHBand="0" w:noVBand="1" w:val="04A0"/>
+      </w:tblPr>
+      <w:tblGrid>
+        <w:gridCol w:w="9360"/>
+      </w:tblGrid>
+      <w:tr>
+        <w:trPr>
+          <w:cantSplit/>
+        </w:trPr>
+        <w:tc>
+          <w:tcPr>
+            <w:tcW w:type="dxa" w:w="9360"/>
+            <w:shd w:val="clear" w:color="auto" w:fill="E8F5E9"/>
+            <w:tcBorders>
+              <w:top w:val="single" w:sz="4" w:space="0" w:color="43A047"/>
+              <w:left w:val="single" w:sz="30" w:space="0" w:color="43A047"/>
+              <w:bottom w:val="single" w:sz="4" w:space="0" w:color="43A047"/>
+              <w:right w:val="single" w:sz="4" w:space="0" w:color="43A047"/>
+            </w:tcBorders>
+            <w:tcMar>
+              <w:top w:w="110" w:type="dxa"/>
+              <w:start w:w="170" w:type="dxa"/>
+              <w:bottom w:w="110" w:type="dxa"/>
+              <w:end w:w="170" w:type="dxa"/>
+            </w:tcMar>
+          </w:tcPr>
+          <w:p>
+            <w:pPr>
+              <w:spacing w:after="0"/>
+            </w:pPr>
+            <w:r>
+              <w:rPr>
+                <w:b/>
+                <w:color w:val="2E7D32"/>
+                <w:sz w:val="21"/>
+              </w:rPr>
+              <w:t xml:space="preserve">QUICK VERSION   </w:t>
+            </w:r>
+            <w:r>
+              <w:rPr>
+                <w:color w:val="222B38"/>
+              </w:rPr>
+              <w:t xml:space="preserve">On an issue you can add </w:t>
+            </w:r>
+            <w:r>
+              <w:rPr>
+                <w:b/>
+                <w:color w:val="222B38"/>
+              </w:rPr>
+              <w:t>Notes</w:t>
+            </w:r>
+            <w:r>
+              <w:rPr>
+                <w:color w:val="222B38"/>
+              </w:rPr>
+              <w:t xml:space="preserve"> to discuss it, upload </w:t>
+            </w:r>
+            <w:r>
+              <w:rPr>
+                <w:b/>
+                <w:color w:val="222B38"/>
+              </w:rPr>
+              <w:t>Attachments</w:t>
+            </w:r>
+            <w:r>
+              <w:rPr>
+                <w:color w:val="222B38"/>
+              </w:rPr>
+              <w:t xml:space="preserve">, add </w:t>
+            </w:r>
+            <w:r>
+              <w:rPr>
+                <w:b/>
+                <w:color w:val="222B38"/>
+              </w:rPr>
+              <w:t>Tags</w:t>
+            </w:r>
+            <w:r>
+              <w:rPr>
+                <w:color w:val="222B38"/>
+              </w:rPr>
+              <w:t xml:space="preserve"> to label it, and add </w:t>
+            </w:r>
+            <w:r>
+              <w:rPr>
+                <w:b/>
+                <w:color w:val="222B38"/>
+              </w:rPr>
+              <w:t>Relationships</w:t>
+            </w:r>
+            <w:r>
+              <w:rPr>
+                <w:color w:val="222B38"/>
+              </w:rPr>
+              <w:t xml:space="preserve"> to link it to other issues.</w:t>
+            </w:r>
+          </w:p>
+        </w:tc>
+      </w:tr>
+    </w:tbl>
+    <w:p>
+      <w:pPr>
+        <w:spacing w:after="80"/>
+      </w:pPr>
+    </w:p>
     <w:p>
       <w:pPr>
         <w:pStyle w:val="Heading1"/>
@@ -9116,6 +9970,90 @@
         <w:spacing w:after="40"/>
       </w:pPr>
     </w:p>
+    <w:tbl>
+      <w:tblPr>
+        <w:tblW w:type="auto" w:w="0"/>
+        <w:jc w:val="center"/>
+        <w:tblLayout w:type="fixed"/>
+        <w:tblLook w:firstColumn="1" w:firstRow="1" w:lastColumn="0" w:lastRow="0" w:noHBand="0" w:noVBand="1" w:val="04A0"/>
+      </w:tblPr>
+      <w:tblGrid>
+        <w:gridCol w:w="9360"/>
+      </w:tblGrid>
+      <w:tr>
+        <w:trPr>
+          <w:cantSplit/>
+        </w:trPr>
+        <w:tc>
+          <w:tcPr>
+            <w:tcW w:type="dxa" w:w="9360"/>
+            <w:shd w:val="clear" w:color="auto" w:fill="E8F5E9"/>
+            <w:tcBorders>
+              <w:top w:val="single" w:sz="4" w:space="0" w:color="43A047"/>
+              <w:left w:val="single" w:sz="30" w:space="0" w:color="43A047"/>
+              <w:bottom w:val="single" w:sz="4" w:space="0" w:color="43A047"/>
+              <w:right w:val="single" w:sz="4" w:space="0" w:color="43A047"/>
+            </w:tcBorders>
+            <w:tcMar>
+              <w:top w:w="110" w:type="dxa"/>
+              <w:start w:w="170" w:type="dxa"/>
+              <w:bottom w:w="110" w:type="dxa"/>
+              <w:end w:w="170" w:type="dxa"/>
+            </w:tcMar>
+          </w:tcPr>
+          <w:p>
+            <w:pPr>
+              <w:spacing w:after="0"/>
+            </w:pPr>
+            <w:r>
+              <w:rPr>
+                <w:b/>
+                <w:color w:val="2E7D32"/>
+                <w:sz w:val="21"/>
+              </w:rPr>
+              <w:t xml:space="preserve">QUICK VERSION   </w:t>
+            </w:r>
+            <w:r>
+              <w:rPr>
+                <w:color w:val="222B38"/>
+              </w:rPr>
+              <w:t xml:space="preserve">Need to track something extra (like a Customer or Environment)? A </w:t>
+            </w:r>
+            <w:r>
+              <w:rPr>
+                <w:b/>
+                <w:color w:val="222B38"/>
+              </w:rPr>
+              <w:t>Manager</w:t>
+            </w:r>
+            <w:r>
+              <w:rPr>
+                <w:color w:val="222B38"/>
+              </w:rPr>
+              <w:t xml:space="preserve"> adds the field under </w:t>
+            </w:r>
+            <w:r>
+              <w:rPr>
+                <w:b/>
+                <w:color w:val="222B38"/>
+              </w:rPr>
+              <w:t>Settings → Custom fields</w:t>
+            </w:r>
+            <w:r>
+              <w:rPr>
+                <w:color w:val="222B38"/>
+              </w:rPr>
+              <w:t>, and then everyone fills it in on each issue.</w:t>
+            </w:r>
+          </w:p>
+        </w:tc>
+      </w:tr>
+    </w:tbl>
+    <w:p>
+      <w:pPr>
+        <w:spacing w:after="80"/>
+      </w:pPr>
+    </w:p>
     <w:p>
       <w:pPr>
         <w:pStyle w:val="Heading1"/>
@@ -9548,6 +10486,103 @@
         <w:spacing w:after="40"/>
       </w:pPr>
     </w:p>
+    <w:tbl>
+      <w:tblPr>
+        <w:tblW w:type="auto" w:w="0"/>
+        <w:jc w:val="center"/>
+        <w:tblLayout w:type="fixed"/>
+        <w:tblLook w:firstColumn="1" w:firstRow="1" w:lastColumn="0" w:lastRow="0" w:noHBand="0" w:noVBand="1" w:val="04A0"/>
+      </w:tblPr>
+      <w:tblGrid>
+        <w:gridCol w:w="9360"/>
+      </w:tblGrid>
+      <w:tr>
+        <w:trPr>
+          <w:cantSplit/>
+        </w:trPr>
+        <w:tc>
+          <w:tcPr>
+            <w:tcW w:type="dxa" w:w="9360"/>
+            <w:shd w:val="clear" w:color="auto" w:fill="E8F5E9"/>
+            <w:tcBorders>
+              <w:top w:val="single" w:sz="4" w:space="0" w:color="43A047"/>
+              <w:left w:val="single" w:sz="30" w:space="0" w:color="43A047"/>
+              <w:bottom w:val="single" w:sz="4" w:space="0" w:color="43A047"/>
+              <w:right w:val="single" w:sz="4" w:space="0" w:color="43A047"/>
+            </w:tcBorders>
+            <w:tcMar>
+              <w:top w:w="110" w:type="dxa"/>
+              <w:start w:w="170" w:type="dxa"/>
+              <w:bottom w:w="110" w:type="dxa"/>
+              <w:end w:w="170" w:type="dxa"/>
+            </w:tcMar>
+          </w:tcPr>
+          <w:p>
+            <w:pPr>
+              <w:spacing w:after="0"/>
+            </w:pPr>
+            <w:r>
+              <w:rPr>
+                <w:b/>
+                <w:color w:val="2E7D32"/>
+                <w:sz w:val="21"/>
+              </w:rPr>
+              <w:t xml:space="preserve">QUICK VERSION   </w:t>
+            </w:r>
+            <w:r>
+              <w:rPr>
+                <w:color w:val="222B38"/>
+              </w:rPr>
+              <w:t xml:space="preserve">Click </w:t>
+            </w:r>
+            <w:r>
+              <w:rPr>
+                <w:b/>
+                <w:color w:val="222B38"/>
+              </w:rPr>
+              <w:t>Issues</w:t>
+            </w:r>
+            <w:r>
+              <w:rPr>
+                <w:color w:val="222B38"/>
+              </w:rPr>
+              <w:t xml:space="preserve">, set the filters (project, status, severity, or a text search) and click </w:t>
+            </w:r>
+            <w:r>
+              <w:rPr>
+                <w:b/>
+                <w:color w:val="222B38"/>
+              </w:rPr>
+              <w:t>Search</w:t>
+            </w:r>
+            <w:r>
+              <w:rPr>
+                <w:color w:val="222B38"/>
+              </w:rPr>
+              <w:t xml:space="preserve">. Save a filter you use a lot, or press </w:t>
+            </w:r>
+            <w:r>
+              <w:rPr>
+                <w:b/>
+                <w:color w:val="222B38"/>
+              </w:rPr>
+              <w:t>Ctrl+K</w:t>
+            </w:r>
+            <w:r>
+              <w:rPr>
+                <w:color w:val="222B38"/>
+              </w:rPr>
+              <w:t xml:space="preserve"> to jump anywhere fast.</w:t>
+            </w:r>
+          </w:p>
+        </w:tc>
+      </w:tr>
+    </w:tbl>
+    <w:p>
+      <w:pPr>
+        <w:spacing w:after="80"/>
+      </w:pPr>
+    </w:p>
     <w:p>
       <w:pPr>
         <w:pStyle w:val="Heading1"/>
@@ -10285,6 +11320,77 @@
         <w:spacing w:after="40"/>
       </w:pPr>
     </w:p>
+    <w:tbl>
+      <w:tblPr>
+        <w:tblW w:type="auto" w:w="0"/>
+        <w:jc w:val="center"/>
+        <w:tblLayout w:type="fixed"/>
+        <w:tblLook w:firstColumn="1" w:firstRow="1" w:lastColumn="0" w:lastRow="0" w:noHBand="0" w:noVBand="1" w:val="04A0"/>
+      </w:tblPr>
+      <w:tblGrid>
+        <w:gridCol w:w="9360"/>
+      </w:tblGrid>
+      <w:tr>
+        <w:trPr>
+          <w:cantSplit/>
+        </w:trPr>
+        <w:tc>
+          <w:tcPr>
+            <w:tcW w:type="dxa" w:w="9360"/>
+            <w:shd w:val="clear" w:color="auto" w:fill="E8F5E9"/>
+            <w:tcBorders>
+              <w:top w:val="single" w:sz="4" w:space="0" w:color="43A047"/>
+              <w:left w:val="single" w:sz="30" w:space="0" w:color="43A047"/>
+              <w:bottom w:val="single" w:sz="4" w:space="0" w:color="43A047"/>
+              <w:right w:val="single" w:sz="4" w:space="0" w:color="43A047"/>
+            </w:tcBorders>
+            <w:tcMar>
+              <w:top w:w="110" w:type="dxa"/>
+              <w:start w:w="170" w:type="dxa"/>
+              <w:bottom w:w="110" w:type="dxa"/>
+              <w:end w:w="170" w:type="dxa"/>
+            </w:tcMar>
+          </w:tcPr>
+          <w:p>
+            <w:pPr>
+              <w:spacing w:after="0"/>
+            </w:pPr>
+            <w:r>
+              <w:rPr>
+                <w:b/>
+                <w:color w:val="2E7D32"/>
+                <w:sz w:val="21"/>
+              </w:rPr>
+              <w:t xml:space="preserve">QUICK VERSION   </w:t>
+            </w:r>
+            <w:r>
+              <w:rPr>
+                <w:color w:val="222B38"/>
+              </w:rPr>
+              <w:t xml:space="preserve">The </w:t>
+            </w:r>
+            <w:r>
+              <w:rPr>
+                <w:b/>
+                <w:color w:val="222B38"/>
+              </w:rPr>
+              <w:t>Board</w:t>
+            </w:r>
+            <w:r>
+              <w:rPr>
+                <w:color w:val="222B38"/>
+              </w:rPr>
+              <w:t xml:space="preserve"> shows a project's issues as cards in columns by status. Move a card to the next column to change its status — a visual to-do wall.</w:t>
+            </w:r>
+          </w:p>
+        </w:tc>
+      </w:tr>
+    </w:tbl>
+    <w:p>
+      <w:pPr>
+        <w:spacing w:after="80"/>
+      </w:pPr>
+    </w:p>
     <w:p>
       <w:pPr>
         <w:pStyle w:val="Heading1"/>
@@ -10624,6 +11730,103 @@
         <w:spacing w:after="40"/>
       </w:pPr>
     </w:p>
+    <w:tbl>
+      <w:tblPr>
+        <w:tblW w:type="auto" w:w="0"/>
+        <w:jc w:val="center"/>
+        <w:tblLayout w:type="fixed"/>
+        <w:tblLook w:firstColumn="1" w:firstRow="1" w:lastColumn="0" w:lastRow="0" w:noHBand="0" w:noVBand="1" w:val="04A0"/>
+      </w:tblPr>
+      <w:tblGrid>
+        <w:gridCol w:w="9360"/>
+      </w:tblGrid>
+      <w:tr>
+        <w:trPr>
+          <w:cantSplit/>
+        </w:trPr>
+        <w:tc>
+          <w:tcPr>
+            <w:tcW w:type="dxa" w:w="9360"/>
+            <w:shd w:val="clear" w:color="auto" w:fill="E8F5E9"/>
+            <w:tcBorders>
+              <w:top w:val="single" w:sz="4" w:space="0" w:color="43A047"/>
+              <w:left w:val="single" w:sz="30" w:space="0" w:color="43A047"/>
+              <w:bottom w:val="single" w:sz="4" w:space="0" w:color="43A047"/>
+              <w:right w:val="single" w:sz="4" w:space="0" w:color="43A047"/>
+            </w:tcBorders>
+            <w:tcMar>
+              <w:top w:w="110" w:type="dxa"/>
+              <w:start w:w="170" w:type="dxa"/>
+              <w:bottom w:w="110" w:type="dxa"/>
+              <w:end w:w="170" w:type="dxa"/>
+            </w:tcMar>
+          </w:tcPr>
+          <w:p>
+            <w:pPr>
+              <w:spacing w:after="0"/>
+            </w:pPr>
+            <w:r>
+              <w:rPr>
+                <w:b/>
+                <w:color w:val="2E7D32"/>
+                <w:sz w:val="21"/>
+              </w:rPr>
+              <w:t xml:space="preserve">QUICK VERSION   </w:t>
+            </w:r>
+            <w:r>
+              <w:rPr>
+                <w:color w:val="222B38"/>
+              </w:rPr>
+              <w:t xml:space="preserve">Click </w:t>
+            </w:r>
+            <w:r>
+              <w:rPr>
+                <w:b/>
+                <w:color w:val="222B38"/>
+              </w:rPr>
+              <w:t>Monitor</w:t>
+            </w:r>
+            <w:r>
+              <w:rPr>
+                <w:color w:val="222B38"/>
+              </w:rPr>
+              <w:t xml:space="preserve"> on an issue to be told when it changes. Check </w:t>
+            </w:r>
+            <w:r>
+              <w:rPr>
+                <w:b/>
+                <w:color w:val="222B38"/>
+              </w:rPr>
+              <w:t>Notifications</w:t>
+            </w:r>
+            <w:r>
+              <w:rPr>
+                <w:color w:val="222B38"/>
+              </w:rPr>
+              <w:t xml:space="preserve"> on the left for updates. Record the minutes you spend in the issue's </w:t>
+            </w:r>
+            <w:r>
+              <w:rPr>
+                <w:b/>
+                <w:color w:val="222B38"/>
+              </w:rPr>
+              <w:t>Time log</w:t>
+            </w:r>
+            <w:r>
+              <w:rPr>
+                <w:color w:val="222B38"/>
+              </w:rPr>
+              <w:t>.</w:t>
+            </w:r>
+          </w:p>
+        </w:tc>
+      </w:tr>
+    </w:tbl>
+    <w:p>
+      <w:pPr>
+        <w:spacing w:after="80"/>
+      </w:pPr>
+    </w:p>
     <w:p>
       <w:pPr>
         <w:pStyle w:val="Heading1"/>
@@ -11170,6 +12373,129 @@
         <w:spacing w:after="40"/>
       </w:pPr>
     </w:p>
+    <w:tbl>
+      <w:tblPr>
+        <w:tblW w:type="auto" w:w="0"/>
+        <w:jc w:val="center"/>
+        <w:tblLayout w:type="fixed"/>
+        <w:tblLook w:firstColumn="1" w:firstRow="1" w:lastColumn="0" w:lastRow="0" w:noHBand="0" w:noVBand="1" w:val="04A0"/>
+      </w:tblPr>
+      <w:tblGrid>
+        <w:gridCol w:w="9360"/>
+      </w:tblGrid>
+      <w:tr>
+        <w:trPr>
+          <w:cantSplit/>
+        </w:trPr>
+        <w:tc>
+          <w:tcPr>
+            <w:tcW w:type="dxa" w:w="9360"/>
+            <w:shd w:val="clear" w:color="auto" w:fill="E8F5E9"/>
+            <w:tcBorders>
+              <w:top w:val="single" w:sz="4" w:space="0" w:color="43A047"/>
+              <w:left w:val="single" w:sz="30" w:space="0" w:color="43A047"/>
+              <w:bottom w:val="single" w:sz="4" w:space="0" w:color="43A047"/>
+              <w:right w:val="single" w:sz="4" w:space="0" w:color="43A047"/>
+            </w:tcBorders>
+            <w:tcMar>
+              <w:top w:w="110" w:type="dxa"/>
+              <w:start w:w="170" w:type="dxa"/>
+              <w:bottom w:w="110" w:type="dxa"/>
+              <w:end w:w="170" w:type="dxa"/>
+            </w:tcMar>
+          </w:tcPr>
+          <w:p>
+            <w:pPr>
+              <w:spacing w:after="0"/>
+            </w:pPr>
+            <w:r>
+              <w:rPr>
+                <w:b/>
+                <w:color w:val="2E7D32"/>
+                <w:sz w:val="21"/>
+              </w:rPr>
+              <w:t xml:space="preserve">QUICK VERSION   </w:t>
+            </w:r>
+            <w:r>
+              <w:rPr>
+                <w:color w:val="222B38"/>
+              </w:rPr>
+              <w:t xml:space="preserve">A </w:t>
+            </w:r>
+            <w:r>
+              <w:rPr>
+                <w:b/>
+                <w:color w:val="222B38"/>
+              </w:rPr>
+              <w:t>Manager</w:t>
+            </w:r>
+            <w:r>
+              <w:rPr>
+                <w:color w:val="222B38"/>
+              </w:rPr>
+              <w:t xml:space="preserve"> sets a deadline (in hours) for each priority. OpenTrack then flags every issue </w:t>
+            </w:r>
+            <w:r>
+              <w:rPr>
+                <w:b/>
+                <w:color w:val="222B38"/>
+              </w:rPr>
+              <w:t>On track</w:t>
+            </w:r>
+            <w:r>
+              <w:rPr>
+                <w:color w:val="222B38"/>
+              </w:rPr>
+              <w:t xml:space="preserve">, </w:t>
+            </w:r>
+            <w:r>
+              <w:rPr>
+                <w:b/>
+                <w:color w:val="222B38"/>
+              </w:rPr>
+              <w:t>At risk</w:t>
+            </w:r>
+            <w:r>
+              <w:rPr>
+                <w:color w:val="222B38"/>
+              </w:rPr>
+              <w:t xml:space="preserve">, or </w:t>
+            </w:r>
+            <w:r>
+              <w:rPr>
+                <w:b/>
+                <w:color w:val="222B38"/>
+              </w:rPr>
+              <w:t>Breached</w:t>
+            </w:r>
+            <w:r>
+              <w:rPr>
+                <w:color w:val="222B38"/>
+              </w:rPr>
+              <w:t xml:space="preserve">, and the </w:t>
+            </w:r>
+            <w:r>
+              <w:rPr>
+                <w:b/>
+                <w:color w:val="222B38"/>
+              </w:rPr>
+              <w:t>SLA status</w:t>
+            </w:r>
+            <w:r>
+              <w:rPr>
+                <w:color w:val="222B38"/>
+              </w:rPr>
+              <w:t xml:space="preserve"> page lists what needs attention right now.</w:t>
+            </w:r>
+          </w:p>
+        </w:tc>
+      </w:tr>
+    </w:tbl>
+    <w:p>
+      <w:pPr>
+        <w:spacing w:after="80"/>
+      </w:pPr>
+    </w:p>
     <w:p>
       <w:pPr>
         <w:pStyle w:val="Heading1"/>
@@ -11839,6 +13165,103 @@
         <w:spacing w:after="40"/>
       </w:pPr>
     </w:p>
+    <w:tbl>
+      <w:tblPr>
+        <w:tblW w:type="auto" w:w="0"/>
+        <w:jc w:val="center"/>
+        <w:tblLayout w:type="fixed"/>
+        <w:tblLook w:firstColumn="1" w:firstRow="1" w:lastColumn="0" w:lastRow="0" w:noHBand="0" w:noVBand="1" w:val="04A0"/>
+      </w:tblPr>
+      <w:tblGrid>
+        <w:gridCol w:w="9360"/>
+      </w:tblGrid>
+      <w:tr>
+        <w:trPr>
+          <w:cantSplit/>
+        </w:trPr>
+        <w:tc>
+          <w:tcPr>
+            <w:tcW w:type="dxa" w:w="9360"/>
+            <w:shd w:val="clear" w:color="auto" w:fill="E8F5E9"/>
+            <w:tcBorders>
+              <w:top w:val="single" w:sz="4" w:space="0" w:color="43A047"/>
+              <w:left w:val="single" w:sz="30" w:space="0" w:color="43A047"/>
+              <w:bottom w:val="single" w:sz="4" w:space="0" w:color="43A047"/>
+              <w:right w:val="single" w:sz="4" w:space="0" w:color="43A047"/>
+            </w:tcBorders>
+            <w:tcMar>
+              <w:top w:w="110" w:type="dxa"/>
+              <w:start w:w="170" w:type="dxa"/>
+              <w:bottom w:w="110" w:type="dxa"/>
+              <w:end w:w="170" w:type="dxa"/>
+            </w:tcMar>
+          </w:tcPr>
+          <w:p>
+            <w:pPr>
+              <w:spacing w:after="0"/>
+            </w:pPr>
+            <w:r>
+              <w:rPr>
+                <w:b/>
+                <w:color w:val="2E7D32"/>
+                <w:sz w:val="21"/>
+              </w:rPr>
+              <w:t xml:space="preserve">QUICK VERSION   </w:t>
+            </w:r>
+            <w:r>
+              <w:rPr>
+                <w:color w:val="222B38"/>
+              </w:rPr>
+              <w:t xml:space="preserve">A </w:t>
+            </w:r>
+            <w:r>
+              <w:rPr>
+                <w:b/>
+                <w:color w:val="222B38"/>
+              </w:rPr>
+              <w:t>Manager</w:t>
+            </w:r>
+            <w:r>
+              <w:rPr>
+                <w:color w:val="222B38"/>
+              </w:rPr>
+              <w:t xml:space="preserve"> can set </w:t>
+            </w:r>
+            <w:r>
+              <w:rPr>
+                <w:b/>
+                <w:color w:val="222B38"/>
+              </w:rPr>
+              <w:t>when a new issue looks like this, do that</w:t>
+            </w:r>
+            <w:r>
+              <w:rPr>
+                <w:color w:val="222B38"/>
+              </w:rPr>
+              <w:t xml:space="preserve"> rules under </w:t>
+            </w:r>
+            <w:r>
+              <w:rPr>
+                <w:b/>
+                <w:color w:val="222B38"/>
+              </w:rPr>
+              <w:t>Settings → Automation</w:t>
+            </w:r>
+            <w:r>
+              <w:rPr>
+                <w:color w:val="222B38"/>
+              </w:rPr>
+              <w:t xml:space="preserve"> — so routine sorting (set priority, assign, add a tag) happens by itself.</w:t>
+            </w:r>
+          </w:p>
+        </w:tc>
+      </w:tr>
+    </w:tbl>
+    <w:p>
+      <w:pPr>
+        <w:spacing w:after="80"/>
+      </w:pPr>
+    </w:p>
     <w:p>
       <w:pPr>
         <w:pStyle w:val="Heading1"/>
@@ -12440,6 +13863,90 @@
         <w:spacing w:after="40"/>
       </w:pPr>
     </w:p>
+    <w:tbl>
+      <w:tblPr>
+        <w:tblW w:type="auto" w:w="0"/>
+        <w:jc w:val="center"/>
+        <w:tblLayout w:type="fixed"/>
+        <w:tblLook w:firstColumn="1" w:firstRow="1" w:lastColumn="0" w:lastRow="0" w:noHBand="0" w:noVBand="1" w:val="04A0"/>
+      </w:tblPr>
+      <w:tblGrid>
+        <w:gridCol w:w="9360"/>
+      </w:tblGrid>
+      <w:tr>
+        <w:trPr>
+          <w:cantSplit/>
+        </w:trPr>
+        <w:tc>
+          <w:tcPr>
+            <w:tcW w:type="dxa" w:w="9360"/>
+            <w:shd w:val="clear" w:color="auto" w:fill="E8F5E9"/>
+            <w:tcBorders>
+              <w:top w:val="single" w:sz="4" w:space="0" w:color="43A047"/>
+              <w:left w:val="single" w:sz="30" w:space="0" w:color="43A047"/>
+              <w:bottom w:val="single" w:sz="4" w:space="0" w:color="43A047"/>
+              <w:right w:val="single" w:sz="4" w:space="0" w:color="43A047"/>
+            </w:tcBorders>
+            <w:tcMar>
+              <w:top w:w="110" w:type="dxa"/>
+              <w:start w:w="170" w:type="dxa"/>
+              <w:bottom w:w="110" w:type="dxa"/>
+              <w:end w:w="170" w:type="dxa"/>
+            </w:tcMar>
+          </w:tcPr>
+          <w:p>
+            <w:pPr>
+              <w:spacing w:after="0"/>
+            </w:pPr>
+            <w:r>
+              <w:rPr>
+                <w:b/>
+                <w:color w:val="2E7D32"/>
+                <w:sz w:val="21"/>
+              </w:rPr>
+              <w:t xml:space="preserve">QUICK VERSION   </w:t>
+            </w:r>
+            <w:r>
+              <w:rPr>
+                <w:color w:val="222B38"/>
+              </w:rPr>
+              <w:t xml:space="preserve">By default an issue can jump to any status. A </w:t>
+            </w:r>
+            <w:r>
+              <w:rPr>
+                <w:b/>
+                <w:color w:val="222B38"/>
+              </w:rPr>
+              <w:t>Manager</w:t>
+            </w:r>
+            <w:r>
+              <w:rPr>
+                <w:color w:val="222B38"/>
+              </w:rPr>
+              <w:t xml:space="preserve"> can limit which status changes are allowed under </w:t>
+            </w:r>
+            <w:r>
+              <w:rPr>
+                <w:b/>
+                <w:color w:val="222B38"/>
+              </w:rPr>
+              <w:t>Settings → Workflow</w:t>
+            </w:r>
+            <w:r>
+              <w:rPr>
+                <w:color w:val="222B38"/>
+              </w:rPr>
+              <w:t>, to keep issues moving in order.</w:t>
+            </w:r>
+          </w:p>
+        </w:tc>
+      </w:tr>
+    </w:tbl>
+    <w:p>
+      <w:pPr>
+        <w:spacing w:after="80"/>
+      </w:pPr>
+    </w:p>
     <w:p>
       <w:pPr>
         <w:pStyle w:val="Heading1"/>
@@ -12851,6 +14358,116 @@
         <w:spacing w:after="40"/>
       </w:pPr>
     </w:p>
+    <w:tbl>
+      <w:tblPr>
+        <w:tblW w:type="auto" w:w="0"/>
+        <w:jc w:val="center"/>
+        <w:tblLayout w:type="fixed"/>
+        <w:tblLook w:firstColumn="1" w:firstRow="1" w:lastColumn="0" w:lastRow="0" w:noHBand="0" w:noVBand="1" w:val="04A0"/>
+      </w:tblPr>
+      <w:tblGrid>
+        <w:gridCol w:w="9360"/>
+      </w:tblGrid>
+      <w:tr>
+        <w:trPr>
+          <w:cantSplit/>
+        </w:trPr>
+        <w:tc>
+          <w:tcPr>
+            <w:tcW w:type="dxa" w:w="9360"/>
+            <w:shd w:val="clear" w:color="auto" w:fill="E8F5E9"/>
+            <w:tcBorders>
+              <w:top w:val="single" w:sz="4" w:space="0" w:color="43A047"/>
+              <w:left w:val="single" w:sz="30" w:space="0" w:color="43A047"/>
+              <w:bottom w:val="single" w:sz="4" w:space="0" w:color="43A047"/>
+              <w:right w:val="single" w:sz="4" w:space="0" w:color="43A047"/>
+            </w:tcBorders>
+            <w:tcMar>
+              <w:top w:w="110" w:type="dxa"/>
+              <w:start w:w="170" w:type="dxa"/>
+              <w:bottom w:w="110" w:type="dxa"/>
+              <w:end w:w="170" w:type="dxa"/>
+            </w:tcMar>
+          </w:tcPr>
+          <w:p>
+            <w:pPr>
+              <w:spacing w:after="0"/>
+            </w:pPr>
+            <w:r>
+              <w:rPr>
+                <w:b/>
+                <w:color w:val="2E7D32"/>
+                <w:sz w:val="21"/>
+              </w:rPr>
+              <w:t xml:space="preserve">QUICK VERSION   </w:t>
+            </w:r>
+            <w:r>
+              <w:rPr>
+                <w:color w:val="222B38"/>
+              </w:rPr>
+              <w:t xml:space="preserve">Put a </w:t>
+            </w:r>
+            <w:r>
+              <w:rPr>
+                <w:b/>
+                <w:color w:val="222B38"/>
+              </w:rPr>
+              <w:t>Fix version</w:t>
+            </w:r>
+            <w:r>
+              <w:rPr>
+                <w:color w:val="222B38"/>
+              </w:rPr>
+              <w:t xml:space="preserve"> on issues and OpenTrack builds a </w:t>
+            </w:r>
+            <w:r>
+              <w:rPr>
+                <w:b/>
+                <w:color w:val="222B38"/>
+              </w:rPr>
+              <w:t>Roadmap</w:t>
+            </w:r>
+            <w:r>
+              <w:rPr>
+                <w:color w:val="222B38"/>
+              </w:rPr>
+              <w:t xml:space="preserve"> (what's coming) and a </w:t>
+            </w:r>
+            <w:r>
+              <w:rPr>
+                <w:b/>
+                <w:color w:val="222B38"/>
+              </w:rPr>
+              <w:t>Changelog</w:t>
+            </w:r>
+            <w:r>
+              <w:rPr>
+                <w:color w:val="222B38"/>
+              </w:rPr>
+              <w:t xml:space="preserve"> (what shipped). </w:t>
+            </w:r>
+            <w:r>
+              <w:rPr>
+                <w:b/>
+                <w:color w:val="222B38"/>
+              </w:rPr>
+              <w:t>Reports</w:t>
+            </w:r>
+            <w:r>
+              <w:rPr>
+                <w:color w:val="222B38"/>
+              </w:rPr>
+              <w:t xml:space="preserve"> shows charts of your issues over time.</w:t>
+            </w:r>
+          </w:p>
+        </w:tc>
+      </w:tr>
+    </w:tbl>
+    <w:p>
+      <w:pPr>
+        <w:spacing w:after="80"/>
+      </w:pPr>
+    </w:p>
     <w:p>
       <w:pPr>
         <w:pStyle w:val="Heading1"/>
@@ -13351,6 +14968,116 @@
         <w:spacing w:after="40"/>
       </w:pPr>
     </w:p>
+    <w:tbl>
+      <w:tblPr>
+        <w:tblW w:type="auto" w:w="0"/>
+        <w:jc w:val="center"/>
+        <w:tblLayout w:type="fixed"/>
+        <w:tblLook w:firstColumn="1" w:firstRow="1" w:lastColumn="0" w:lastRow="0" w:noHBand="0" w:noVBand="1" w:val="04A0"/>
+      </w:tblPr>
+      <w:tblGrid>
+        <w:gridCol w:w="9360"/>
+      </w:tblGrid>
+      <w:tr>
+        <w:trPr>
+          <w:cantSplit/>
+        </w:trPr>
+        <w:tc>
+          <w:tcPr>
+            <w:tcW w:type="dxa" w:w="9360"/>
+            <w:shd w:val="clear" w:color="auto" w:fill="E8F5E9"/>
+            <w:tcBorders>
+              <w:top w:val="single" w:sz="4" w:space="0" w:color="43A047"/>
+              <w:left w:val="single" w:sz="30" w:space="0" w:color="43A047"/>
+              <w:bottom w:val="single" w:sz="4" w:space="0" w:color="43A047"/>
+              <w:right w:val="single" w:sz="4" w:space="0" w:color="43A047"/>
+            </w:tcBorders>
+            <w:tcMar>
+              <w:top w:w="110" w:type="dxa"/>
+              <w:start w:w="170" w:type="dxa"/>
+              <w:bottom w:w="110" w:type="dxa"/>
+              <w:end w:w="170" w:type="dxa"/>
+            </w:tcMar>
+          </w:tcPr>
+          <w:p>
+            <w:pPr>
+              <w:spacing w:after="0"/>
+            </w:pPr>
+            <w:r>
+              <w:rPr>
+                <w:b/>
+                <w:color w:val="2E7D32"/>
+                <w:sz w:val="21"/>
+              </w:rPr>
+              <w:t xml:space="preserve">QUICK VERSION   </w:t>
+            </w:r>
+            <w:r>
+              <w:rPr>
+                <w:color w:val="222B38"/>
+              </w:rPr>
+              <w:t xml:space="preserve">Build a reusable checklist for a project (paste a whole list, or add items one at a time), then work down it tapping </w:t>
+            </w:r>
+            <w:r>
+              <w:rPr>
+                <w:b/>
+                <w:color w:val="222B38"/>
+              </w:rPr>
+              <w:t>Pass</w:t>
+            </w:r>
+            <w:r>
+              <w:rPr>
+                <w:color w:val="222B38"/>
+              </w:rPr>
+              <w:t xml:space="preserve">, </w:t>
+            </w:r>
+            <w:r>
+              <w:rPr>
+                <w:b/>
+                <w:color w:val="222B38"/>
+              </w:rPr>
+              <w:t>Fail</w:t>
+            </w:r>
+            <w:r>
+              <w:rPr>
+                <w:color w:val="222B38"/>
+              </w:rPr>
+              <w:t xml:space="preserve">, or </w:t>
+            </w:r>
+            <w:r>
+              <w:rPr>
+                <w:b/>
+                <w:color w:val="222B38"/>
+              </w:rPr>
+              <w:t>N/A</w:t>
+            </w:r>
+            <w:r>
+              <w:rPr>
+                <w:color w:val="222B38"/>
+              </w:rPr>
+              <w:t xml:space="preserve">. A </w:t>
+            </w:r>
+            <w:r>
+              <w:rPr>
+                <w:b/>
+                <w:color w:val="222B38"/>
+              </w:rPr>
+              <w:t>Fail</w:t>
+            </w:r>
+            <w:r>
+              <w:rPr>
+                <w:color w:val="222B38"/>
+              </w:rPr>
+              <w:t xml:space="preserve"> becomes a tracked issue in one tap.</w:t>
+            </w:r>
+          </w:p>
+        </w:tc>
+      </w:tr>
+    </w:tbl>
+    <w:p>
+      <w:pPr>
+        <w:spacing w:after="80"/>
+      </w:pPr>
+    </w:p>
     <w:p>
       <w:pPr>
         <w:pStyle w:val="Heading1"/>
@@ -14459,6 +16186,103 @@
         <w:spacing w:after="40"/>
       </w:pPr>
     </w:p>
+    <w:tbl>
+      <w:tblPr>
+        <w:tblW w:type="auto" w:w="0"/>
+        <w:jc w:val="center"/>
+        <w:tblLayout w:type="fixed"/>
+        <w:tblLook w:firstColumn="1" w:firstRow="1" w:lastColumn="0" w:lastRow="0" w:noHBand="0" w:noVBand="1" w:val="04A0"/>
+      </w:tblPr>
+      <w:tblGrid>
+        <w:gridCol w:w="9360"/>
+      </w:tblGrid>
+      <w:tr>
+        <w:trPr>
+          <w:cantSplit/>
+        </w:trPr>
+        <w:tc>
+          <w:tcPr>
+            <w:tcW w:type="dxa" w:w="9360"/>
+            <w:shd w:val="clear" w:color="auto" w:fill="E8F5E9"/>
+            <w:tcBorders>
+              <w:top w:val="single" w:sz="4" w:space="0" w:color="43A047"/>
+              <w:left w:val="single" w:sz="30" w:space="0" w:color="43A047"/>
+              <w:bottom w:val="single" w:sz="4" w:space="0" w:color="43A047"/>
+              <w:right w:val="single" w:sz="4" w:space="0" w:color="43A047"/>
+            </w:tcBorders>
+            <w:tcMar>
+              <w:top w:w="110" w:type="dxa"/>
+              <w:start w:w="170" w:type="dxa"/>
+              <w:bottom w:w="110" w:type="dxa"/>
+              <w:end w:w="170" w:type="dxa"/>
+            </w:tcMar>
+          </w:tcPr>
+          <w:p>
+            <w:pPr>
+              <w:spacing w:after="0"/>
+            </w:pPr>
+            <w:r>
+              <w:rPr>
+                <w:b/>
+                <w:color w:val="2E7D32"/>
+                <w:sz w:val="21"/>
+              </w:rPr>
+              <w:t xml:space="preserve">QUICK VERSION   </w:t>
+            </w:r>
+            <w:r>
+              <w:rPr>
+                <w:color w:val="222B38"/>
+              </w:rPr>
+              <w:t xml:space="preserve">Turn on </w:t>
+            </w:r>
+            <w:r>
+              <w:rPr>
+                <w:b/>
+                <w:color w:val="222B38"/>
+              </w:rPr>
+              <w:t>public intake</w:t>
+            </w:r>
+            <w:r>
+              <w:rPr>
+                <w:color w:val="222B38"/>
+              </w:rPr>
+              <w:t xml:space="preserve"> so people </w:t>
+            </w:r>
+            <w:r>
+              <w:rPr>
+                <w:b/>
+                <w:color w:val="222B38"/>
+              </w:rPr>
+              <w:t>without an account</w:t>
+            </w:r>
+            <w:r>
+              <w:rPr>
+                <w:color w:val="222B38"/>
+              </w:rPr>
+              <w:t xml:space="preserve"> can report a problem — through a link or a scannable </w:t>
+            </w:r>
+            <w:r>
+              <w:rPr>
+                <w:b/>
+                <w:color w:val="222B38"/>
+              </w:rPr>
+              <w:t>QR</w:t>
+            </w:r>
+            <w:r>
+              <w:rPr>
+                <w:color w:val="222B38"/>
+              </w:rPr>
+              <w:t xml:space="preserve"> poster. Their reports arrive as normal issues for you to handle.</w:t>
+            </w:r>
+          </w:p>
+        </w:tc>
+      </w:tr>
+    </w:tbl>
+    <w:p>
+      <w:pPr>
+        <w:spacing w:after="80"/>
+      </w:pPr>
+    </w:p>
     <w:p>
       <w:pPr>
         <w:pStyle w:val="Heading1"/>
@@ -15026,6 +16850,90 @@
         <w:spacing w:after="40"/>
       </w:pPr>
     </w:p>
+    <w:tbl>
+      <w:tblPr>
+        <w:tblW w:type="auto" w:w="0"/>
+        <w:jc w:val="center"/>
+        <w:tblLayout w:type="fixed"/>
+        <w:tblLook w:firstColumn="1" w:firstRow="1" w:lastColumn="0" w:lastRow="0" w:noHBand="0" w:noVBand="1" w:val="04A0"/>
+      </w:tblPr>
+      <w:tblGrid>
+        <w:gridCol w:w="9360"/>
+      </w:tblGrid>
+      <w:tr>
+        <w:trPr>
+          <w:cantSplit/>
+        </w:trPr>
+        <w:tc>
+          <w:tcPr>
+            <w:tcW w:type="dxa" w:w="9360"/>
+            <w:shd w:val="clear" w:color="auto" w:fill="E8F5E9"/>
+            <w:tcBorders>
+              <w:top w:val="single" w:sz="4" w:space="0" w:color="43A047"/>
+              <w:left w:val="single" w:sz="30" w:space="0" w:color="43A047"/>
+              <w:bottom w:val="single" w:sz="4" w:space="0" w:color="43A047"/>
+              <w:right w:val="single" w:sz="4" w:space="0" w:color="43A047"/>
+            </w:tcBorders>
+            <w:tcMar>
+              <w:top w:w="110" w:type="dxa"/>
+              <w:start w:w="170" w:type="dxa"/>
+              <w:bottom w:w="110" w:type="dxa"/>
+              <w:end w:w="170" w:type="dxa"/>
+            </w:tcMar>
+          </w:tcPr>
+          <w:p>
+            <w:pPr>
+              <w:spacing w:after="0"/>
+            </w:pPr>
+            <w:r>
+              <w:rPr>
+                <w:b/>
+                <w:color w:val="2E7D32"/>
+                <w:sz w:val="21"/>
+              </w:rPr>
+              <w:t xml:space="preserve">QUICK VERSION   </w:t>
+            </w:r>
+            <w:r>
+              <w:rPr>
+                <w:color w:val="222B38"/>
+              </w:rPr>
+              <w:t xml:space="preserve">Moving in? </w:t>
+            </w:r>
+            <w:r>
+              <w:rPr>
+                <w:b/>
+                <w:color w:val="222B38"/>
+              </w:rPr>
+              <w:t>Import</w:t>
+            </w:r>
+            <w:r>
+              <w:rPr>
+                <w:color w:val="222B38"/>
+              </w:rPr>
+              <w:t xml:space="preserve"> issues from MantisBT, a spreadsheet, Jira, or GitHub. Your data is always yours: click </w:t>
+            </w:r>
+            <w:r>
+              <w:rPr>
+                <w:b/>
+                <w:color w:val="222B38"/>
+              </w:rPr>
+              <w:t>Backup &amp; export</w:t>
+            </w:r>
+            <w:r>
+              <w:rPr>
+                <w:color w:val="222B38"/>
+              </w:rPr>
+              <w:t xml:space="preserve"> to download it anytime, and you can turn on automatic backups.</w:t>
+            </w:r>
+          </w:p>
+        </w:tc>
+      </w:tr>
+    </w:tbl>
+    <w:p>
+      <w:pPr>
+        <w:spacing w:after="80"/>
+      </w:pPr>
+    </w:p>
     <w:p>
       <w:pPr>
         <w:pStyle w:val="Heading1"/>
@@ -15858,6 +17766,90 @@
     <w:p>
       <w:pPr>
         <w:spacing w:after="40"/>
+      </w:pPr>
+    </w:p>
+    <w:tbl>
+      <w:tblPr>
+        <w:tblW w:type="auto" w:w="0"/>
+        <w:jc w:val="center"/>
+        <w:tblLayout w:type="fixed"/>
+        <w:tblLook w:firstColumn="1" w:firstRow="1" w:lastColumn="0" w:lastRow="0" w:noHBand="0" w:noVBand="1" w:val="04A0"/>
+      </w:tblPr>
+      <w:tblGrid>
+        <w:gridCol w:w="9360"/>
+      </w:tblGrid>
+      <w:tr>
+        <w:trPr>
+          <w:cantSplit/>
+        </w:trPr>
+        <w:tc>
+          <w:tcPr>
+            <w:tcW w:type="dxa" w:w="9360"/>
+            <w:shd w:val="clear" w:color="auto" w:fill="E8F5E9"/>
+            <w:tcBorders>
+              <w:top w:val="single" w:sz="4" w:space="0" w:color="43A047"/>
+              <w:left w:val="single" w:sz="30" w:space="0" w:color="43A047"/>
+              <w:bottom w:val="single" w:sz="4" w:space="0" w:color="43A047"/>
+              <w:right w:val="single" w:sz="4" w:space="0" w:color="43A047"/>
+            </w:tcBorders>
+            <w:tcMar>
+              <w:top w:w="110" w:type="dxa"/>
+              <w:start w:w="170" w:type="dxa"/>
+              <w:bottom w:w="110" w:type="dxa"/>
+              <w:end w:w="170" w:type="dxa"/>
+            </w:tcMar>
+          </w:tcPr>
+          <w:p>
+            <w:pPr>
+              <w:spacing w:after="0"/>
+            </w:pPr>
+            <w:r>
+              <w:rPr>
+                <w:b/>
+                <w:color w:val="2E7D32"/>
+                <w:sz w:val="21"/>
+              </w:rPr>
+              <w:t xml:space="preserve">QUICK VERSION   </w:t>
+            </w:r>
+            <w:r>
+              <w:rPr>
+                <w:color w:val="222B38"/>
+              </w:rPr>
+              <w:t xml:space="preserve">If your administrator turns it on, extra </w:t>
+            </w:r>
+            <w:r>
+              <w:rPr>
+                <w:b/>
+                <w:color w:val="222B38"/>
+              </w:rPr>
+              <w:t>✨</w:t>
+            </w:r>
+            <w:r>
+              <w:rPr>
+                <w:color w:val="222B38"/>
+              </w:rPr>
+              <w:t xml:space="preserve"> buttons appear: suggest an issue's triage, search in plain English, and summarize a long thread. Every result is a </w:t>
+            </w:r>
+            <w:r>
+              <w:rPr>
+                <w:b/>
+                <w:color w:val="222B38"/>
+              </w:rPr>
+              <w:t>suggestion you can change</w:t>
+            </w:r>
+            <w:r>
+              <w:rPr>
+                <w:color w:val="222B38"/>
+              </w:rPr>
+              <w:t>.</w:t>
+            </w:r>
+          </w:p>
+        </w:tc>
+      </w:tr>
+    </w:tbl>
+    <w:p>
+      <w:pPr>
+        <w:spacing w:after="80"/>
       </w:pPr>
     </w:p>
     <w:p>
@@ -17644,6 +19636,116 @@
         <w:spacing w:after="40"/>
       </w:pPr>
     </w:p>
+    <w:tbl>
+      <w:tblPr>
+        <w:tblW w:type="auto" w:w="0"/>
+        <w:jc w:val="center"/>
+        <w:tblLayout w:type="fixed"/>
+        <w:tblLook w:firstColumn="1" w:firstRow="1" w:lastColumn="0" w:lastRow="0" w:noHBand="0" w:noVBand="1" w:val="04A0"/>
+      </w:tblPr>
+      <w:tblGrid>
+        <w:gridCol w:w="9360"/>
+      </w:tblGrid>
+      <w:tr>
+        <w:trPr>
+          <w:cantSplit/>
+        </w:trPr>
+        <w:tc>
+          <w:tcPr>
+            <w:tcW w:type="dxa" w:w="9360"/>
+            <w:shd w:val="clear" w:color="auto" w:fill="E8F5E9"/>
+            <w:tcBorders>
+              <w:top w:val="single" w:sz="4" w:space="0" w:color="43A047"/>
+              <w:left w:val="single" w:sz="30" w:space="0" w:color="43A047"/>
+              <w:bottom w:val="single" w:sz="4" w:space="0" w:color="43A047"/>
+              <w:right w:val="single" w:sz="4" w:space="0" w:color="43A047"/>
+            </w:tcBorders>
+            <w:tcMar>
+              <w:top w:w="110" w:type="dxa"/>
+              <w:start w:w="170" w:type="dxa"/>
+              <w:bottom w:w="110" w:type="dxa"/>
+              <w:end w:w="170" w:type="dxa"/>
+            </w:tcMar>
+          </w:tcPr>
+          <w:p>
+            <w:pPr>
+              <w:spacing w:after="0"/>
+            </w:pPr>
+            <w:r>
+              <w:rPr>
+                <w:b/>
+                <w:color w:val="2E7D32"/>
+                <w:sz w:val="21"/>
+              </w:rPr>
+              <w:t xml:space="preserve">QUICK VERSION   </w:t>
+            </w:r>
+            <w:r>
+              <w:rPr>
+                <w:color w:val="222B38"/>
+              </w:rPr>
+              <w:t xml:space="preserve">Connect a </w:t>
+            </w:r>
+            <w:r>
+              <w:rPr>
+                <w:b/>
+                <w:color w:val="222B38"/>
+              </w:rPr>
+              <w:t>GitHub</w:t>
+            </w:r>
+            <w:r>
+              <w:rPr>
+                <w:color w:val="222B38"/>
+              </w:rPr>
+              <w:t xml:space="preserve"> repository so a commit that says </w:t>
+            </w:r>
+            <w:r>
+              <w:rPr>
+                <w:b/>
+                <w:color w:val="222B38"/>
+              </w:rPr>
+              <w:t>fixes #123</w:t>
+            </w:r>
+            <w:r>
+              <w:rPr>
+                <w:color w:val="222B38"/>
+              </w:rPr>
+              <w:t xml:space="preserve"> links to (and can resolve) that issue. Add a </w:t>
+            </w:r>
+            <w:r>
+              <w:rPr>
+                <w:b/>
+                <w:color w:val="222B38"/>
+              </w:rPr>
+              <w:t>Slack</w:t>
+            </w:r>
+            <w:r>
+              <w:rPr>
+                <w:color w:val="222B38"/>
+              </w:rPr>
+              <w:t xml:space="preserve"> or </w:t>
+            </w:r>
+            <w:r>
+              <w:rPr>
+                <w:b/>
+                <w:color w:val="222B38"/>
+              </w:rPr>
+              <w:t>Discord</w:t>
+            </w:r>
+            <w:r>
+              <w:rPr>
+                <w:color w:val="222B38"/>
+              </w:rPr>
+              <w:t xml:space="preserve"> webhook to get pinged when issues change.</w:t>
+            </w:r>
+          </w:p>
+        </w:tc>
+      </w:tr>
+    </w:tbl>
+    <w:p>
+      <w:pPr>
+        <w:spacing w:after="80"/>
+      </w:pPr>
+    </w:p>
     <w:p>
       <w:pPr>
         <w:pStyle w:val="Heading1"/>
@@ -18577,6 +20679,77 @@
         <w:spacing w:after="40"/>
       </w:pPr>
     </w:p>
+    <w:tbl>
+      <w:tblPr>
+        <w:tblW w:type="auto" w:w="0"/>
+        <w:jc w:val="center"/>
+        <w:tblLayout w:type="fixed"/>
+        <w:tblLook w:firstColumn="1" w:firstRow="1" w:lastColumn="0" w:lastRow="0" w:noHBand="0" w:noVBand="1" w:val="04A0"/>
+      </w:tblPr>
+      <w:tblGrid>
+        <w:gridCol w:w="9360"/>
+      </w:tblGrid>
+      <w:tr>
+        <w:trPr>
+          <w:cantSplit/>
+        </w:trPr>
+        <w:tc>
+          <w:tcPr>
+            <w:tcW w:type="dxa" w:w="9360"/>
+            <w:shd w:val="clear" w:color="auto" w:fill="E8F5E9"/>
+            <w:tcBorders>
+              <w:top w:val="single" w:sz="4" w:space="0" w:color="43A047"/>
+              <w:left w:val="single" w:sz="30" w:space="0" w:color="43A047"/>
+              <w:bottom w:val="single" w:sz="4" w:space="0" w:color="43A047"/>
+              <w:right w:val="single" w:sz="4" w:space="0" w:color="43A047"/>
+            </w:tcBorders>
+            <w:tcMar>
+              <w:top w:w="110" w:type="dxa"/>
+              <w:start w:w="170" w:type="dxa"/>
+              <w:bottom w:w="110" w:type="dxa"/>
+              <w:end w:w="170" w:type="dxa"/>
+            </w:tcMar>
+          </w:tcPr>
+          <w:p>
+            <w:pPr>
+              <w:spacing w:after="0"/>
+            </w:pPr>
+            <w:r>
+              <w:rPr>
+                <w:b/>
+                <w:color w:val="2E7D32"/>
+                <w:sz w:val="21"/>
+              </w:rPr>
+              <w:t xml:space="preserve">QUICK VERSION   </w:t>
+            </w:r>
+            <w:r>
+              <w:rPr>
+                <w:color w:val="222B38"/>
+              </w:rPr>
+              <w:t xml:space="preserve">OpenTrack installs on a tablet or phone like an app (no app store), keeps working through brief network drops for checklists, can stamp your </w:t>
+            </w:r>
+            <w:r>
+              <w:rPr>
+                <w:b/>
+                <w:color w:val="222B38"/>
+              </w:rPr>
+              <w:t>GPS</w:t>
+            </w:r>
+            <w:r>
+              <w:rPr>
+                <w:color w:val="222B38"/>
+              </w:rPr>
+              <w:t xml:space="preserve"> location on an issue, and accepts QR-scanned reports.</w:t>
+            </w:r>
+          </w:p>
+        </w:tc>
+      </w:tr>
+    </w:tbl>
+    <w:p>
+      <w:pPr>
+        <w:spacing w:after="80"/>
+      </w:pPr>
+    </w:p>
     <w:p>
       <w:pPr>
         <w:pStyle w:val="Heading1"/>
@@ -19132,6 +21305,97 @@
     <w:p>
       <w:pPr>
         <w:spacing w:after="40"/>
+      </w:pPr>
+    </w:p>
+    <w:tbl>
+      <w:tblPr>
+        <w:tblW w:type="auto" w:w="0"/>
+        <w:jc w:val="center"/>
+        <w:tblLayout w:type="fixed"/>
+        <w:tblLook w:firstColumn="1" w:firstRow="1" w:lastColumn="0" w:lastRow="0" w:noHBand="0" w:noVBand="1" w:val="04A0"/>
+      </w:tblPr>
+      <w:tblGrid>
+        <w:gridCol w:w="9360"/>
+      </w:tblGrid>
+      <w:tr>
+        <w:trPr>
+          <w:cantSplit/>
+        </w:trPr>
+        <w:tc>
+          <w:tcPr>
+            <w:tcW w:type="dxa" w:w="9360"/>
+            <w:shd w:val="clear" w:color="auto" w:fill="E8F5E9"/>
+            <w:tcBorders>
+              <w:top w:val="single" w:sz="4" w:space="0" w:color="43A047"/>
+              <w:left w:val="single" w:sz="30" w:space="0" w:color="43A047"/>
+              <w:bottom w:val="single" w:sz="4" w:space="0" w:color="43A047"/>
+              <w:right w:val="single" w:sz="4" w:space="0" w:color="43A047"/>
+            </w:tcBorders>
+            <w:tcMar>
+              <w:top w:w="110" w:type="dxa"/>
+              <w:start w:w="170" w:type="dxa"/>
+              <w:bottom w:w="110" w:type="dxa"/>
+              <w:end w:w="170" w:type="dxa"/>
+            </w:tcMar>
+          </w:tcPr>
+          <w:p>
+            <w:pPr>
+              <w:spacing w:after="0"/>
+            </w:pPr>
+            <w:r>
+              <w:rPr>
+                <w:b/>
+                <w:color w:val="2E7D32"/>
+                <w:sz w:val="21"/>
+              </w:rPr>
+              <w:t xml:space="preserve">QUICK VERSION   </w:t>
+            </w:r>
+            <w:r>
+              <w:rPr>
+                <w:b/>
+                <w:color w:val="222B38"/>
+              </w:rPr>
+              <w:t>Print / PDF</w:t>
+            </w:r>
+            <w:r>
+              <w:rPr>
+                <w:color w:val="222B38"/>
+              </w:rPr>
+              <w:t xml:space="preserve"> an issue from its page. Set your personal defaults under </w:t>
+            </w:r>
+            <w:r>
+              <w:rPr>
+                <w:b/>
+                <w:color w:val="222B38"/>
+              </w:rPr>
+              <w:t>Preferences</w:t>
+            </w:r>
+            <w:r>
+              <w:rPr>
+                <w:color w:val="222B38"/>
+              </w:rPr>
+              <w:t xml:space="preserve">. </w:t>
+            </w:r>
+            <w:r>
+              <w:rPr>
+                <w:b/>
+                <w:color w:val="222B38"/>
+              </w:rPr>
+              <w:t>Administrators</w:t>
+            </w:r>
+            <w:r>
+              <w:rPr>
+                <w:color w:val="222B38"/>
+              </w:rPr>
+              <w:t xml:space="preserve"> manage user accounts and roles.</w:t>
+            </w:r>
+          </w:p>
+        </w:tc>
+      </w:tr>
+    </w:tbl>
+    <w:p>
+      <w:pPr>
+        <w:spacing w:after="80"/>
       </w:pPr>
     </w:p>
     <w:p>

</xml_diff>